<commit_message>
checkpoint: commit working tree
</commit_message>
<xml_diff>
--- a/docs/JAMIA/compile-time-safety/Preventing Silent Errors in Clinical Data Analysis 20260527-v2.docx
+++ b/docs/JAMIA/compile-time-safety/Preventing Silent Errors in Clinical Data Analysis 20260527-v2.docx
@@ -110,7 +110,7 @@
           <w:i/>
           <w:iCs/>
         </w:rPr>
-        <w:t>Tidy-TS</w:t>
+        <w:t>Baseline</w:t>
       </w:r>
       <w:r>
         <w:t>, a TypeScript data analysis framework, to address this gap.</w:t>
@@ -155,7 +155,7 @@
           <w:sz w:val="22"/>
           <w:szCs w:val="22"/>
         </w:rPr>
-        <w:t>Tidy-TS</w:t>
+        <w:t>Baseline</w:t>
       </w:r>
       <w:r>
         <w:rPr>
@@ -262,117 +262,126 @@
           <w:sz w:val="22"/>
           <w:szCs w:val="22"/>
         </w:rPr>
-        <w:t>Tidy-TS</w:t>
-      </w:r>
-      <w:r>
-        <w:rPr>
+        <w:t>B</w:t>
+      </w:r>
+      <w:r>
+        <w:rPr>
+          <w:i/>
+          <w:iCs/>
           <w:sz w:val="22"/>
           <w:szCs w:val="22"/>
         </w:rPr>
-        <w:t>,</w:t>
+        <w:t>aseline</w:t>
       </w:r>
       <w:r>
         <w:rPr>
           <w:sz w:val="22"/>
           <w:szCs w:val="22"/>
         </w:rPr>
-        <w:t xml:space="preserve"> Python (</w:t>
-      </w:r>
-      <w:r>
-        <w:rPr>
-          <w:i/>
-          <w:iCs/>
+        <w:t>,</w:t>
+      </w:r>
+      <w:r>
+        <w:rPr>
           <w:sz w:val="22"/>
           <w:szCs w:val="22"/>
         </w:rPr>
-        <w:t>pandas</w:t>
-      </w:r>
-      <w:r>
-        <w:rPr>
+        <w:t xml:space="preserve"> Python (</w:t>
+      </w:r>
+      <w:r>
+        <w:rPr>
+          <w:i/>
+          <w:iCs/>
           <w:sz w:val="22"/>
           <w:szCs w:val="22"/>
         </w:rPr>
-        <w:t>) and R (</w:t>
-      </w:r>
-      <w:r>
-        <w:rPr>
-          <w:i/>
-          <w:iCs/>
+        <w:t>pandas</w:t>
+      </w:r>
+      <w:r>
+        <w:rPr>
           <w:sz w:val="22"/>
           <w:szCs w:val="22"/>
         </w:rPr>
-        <w:t>tidyverse</w:t>
-      </w:r>
-      <w:r>
-        <w:rPr>
+        <w:t>) and R (</w:t>
+      </w:r>
+      <w:r>
+        <w:rPr>
+          <w:i/>
+          <w:iCs/>
           <w:sz w:val="22"/>
           <w:szCs w:val="22"/>
         </w:rPr>
-        <w:t xml:space="preserve">) </w:t>
+        <w:t>tidyverse</w:t>
       </w:r>
       <w:r>
         <w:rPr>
           <w:sz w:val="22"/>
           <w:szCs w:val="22"/>
         </w:rPr>
-        <w:t>workflows</w:t>
+        <w:t xml:space="preserve">) </w:t>
       </w:r>
       <w:r>
         <w:rPr>
           <w:sz w:val="22"/>
           <w:szCs w:val="22"/>
         </w:rPr>
-        <w:t xml:space="preserve">. </w:t>
+        <w:t>workflows</w:t>
       </w:r>
       <w:r>
         <w:rPr>
           <w:sz w:val="22"/>
           <w:szCs w:val="22"/>
         </w:rPr>
-        <w:t xml:space="preserve">We </w:t>
+        <w:t xml:space="preserve">. </w:t>
       </w:r>
       <w:r>
         <w:rPr>
           <w:sz w:val="22"/>
           <w:szCs w:val="22"/>
         </w:rPr>
-        <w:t>tested</w:t>
+        <w:t xml:space="preserve">We </w:t>
       </w:r>
       <w:r>
         <w:rPr>
           <w:sz w:val="22"/>
           <w:szCs w:val="22"/>
         </w:rPr>
-        <w:t xml:space="preserve"> </w:t>
-      </w:r>
-      <w:r>
-        <w:rPr>
-          <w:i/>
-          <w:iCs/>
+        <w:t>tested</w:t>
+      </w:r>
+      <w:r>
+        <w:rPr>
           <w:sz w:val="22"/>
           <w:szCs w:val="22"/>
         </w:rPr>
-        <w:t>Tidy-TS</w:t>
-      </w:r>
-      <w:r>
-        <w:rPr>
+        <w:t xml:space="preserve"> </w:t>
+      </w:r>
+      <w:r>
+        <w:rPr>
+          <w:i/>
+          <w:iCs/>
           <w:sz w:val="22"/>
           <w:szCs w:val="22"/>
         </w:rPr>
-        <w:t xml:space="preserve"> against an independent collection of 7</w:t>
+        <w:t>Baseline</w:t>
       </w:r>
       <w:r>
         <w:rPr>
           <w:sz w:val="22"/>
           <w:szCs w:val="22"/>
         </w:rPr>
-        <w:t>8</w:t>
+        <w:t xml:space="preserve"> against an independent collection of 7</w:t>
       </w:r>
       <w:r>
         <w:rPr>
           <w:sz w:val="22"/>
           <w:szCs w:val="22"/>
         </w:rPr>
+        <w:t>8</w:t>
+      </w:r>
+      <w:r>
+        <w:rPr>
+          <w:sz w:val="22"/>
+          <w:szCs w:val="22"/>
+        </w:rPr>
         <w:t xml:space="preserve"> real-world data analysis bugs.</w:t>
       </w:r>
     </w:p>
@@ -409,7 +418,7 @@
           <w:sz w:val="22"/>
           <w:szCs w:val="22"/>
         </w:rPr>
-        <w:t>Tidy-TS</w:t>
+        <w:t>Baseline</w:t>
       </w:r>
       <w:r>
         <w:rPr>
@@ -488,7 +497,7 @@
           <w:sz w:val="22"/>
           <w:szCs w:val="22"/>
         </w:rPr>
-        <w:t>Tidy-TS</w:t>
+        <w:t>Baseline</w:t>
       </w:r>
       <w:r>
         <w:rPr>
@@ -819,7 +828,7 @@
           <w:i/>
           <w:iCs/>
         </w:rPr>
-        <w:t>Tidy-TS</w:t>
+        <w:t>Baseline</w:t>
       </w:r>
       <w:r>
         <w:t xml:space="preserve"> is a </w:t>
@@ -847,7 +856,14 @@
           <w:i/>
           <w:iCs/>
         </w:rPr>
-        <w:t xml:space="preserve">Tidy-TS </w:t>
+        <w:t>Baseline</w:t>
+      </w:r>
+      <w:r>
+        <w:rPr>
+          <w:i/>
+          <w:iCs/>
+        </w:rPr>
+        <w:t xml:space="preserve"> </w:t>
       </w:r>
       <w:r>
         <w:t>offers a guardrail that directly addresses a well-documented source of error in clinical and translational research.</w:t>
@@ -1145,7 +1161,14 @@
           <w:i/>
           <w:iCs/>
         </w:rPr>
-        <w:t xml:space="preserve">Tidy-TS, </w:t>
+        <w:t>Baseline</w:t>
+      </w:r>
+      <w:r>
+        <w:rPr>
+          <w:i/>
+          <w:iCs/>
+        </w:rPr>
+        <w:t xml:space="preserve">, </w:t>
       </w:r>
       <w:r>
         <w:t>a novel data analysis framework built in TypeScript</w:t>
@@ -1182,7 +1205,14 @@
           <w:i/>
           <w:iCs/>
         </w:rPr>
-        <w:t xml:space="preserve">Tidy-TS </w:t>
+        <w:t>Baseline</w:t>
+      </w:r>
+      <w:r>
+        <w:rPr>
+          <w:i/>
+          <w:iCs/>
+        </w:rPr>
+        <w:t xml:space="preserve"> </w:t>
       </w:r>
       <w:r>
         <w:t xml:space="preserve">addressed three </w:t>
@@ -1220,7 +1250,16 @@
         <w:spacing w:line="276" w:lineRule="auto"/>
       </w:pPr>
       <w:r>
-        <w:t>How does error detection in Tidy-TS compare to conventional analytical workflows in Python (pandas) and R (tidyverse) when exposed to equivalent clinical data errors?</w:t>
+        <w:t xml:space="preserve">How does error detection in </w:t>
+      </w:r>
+      <w:r>
+        <w:rPr>
+          <w:i/>
+        </w:rPr>
+        <w:t>Baseline</w:t>
+      </w:r>
+      <w:r>
+        <w:t xml:space="preserve"> compare to conventional analytical workflows in Python (pandas) and R (tidyverse) when exposed to equivalent clinical data errors?</w:t>
       </w:r>
     </w:p>
     <w:p>
@@ -1295,7 +1334,7 @@
           <w:i/>
           <w:iCs/>
         </w:rPr>
-        <w:t>Tidy-TS</w:t>
+        <w:t>Baseline</w:t>
       </w:r>
       <w:r>
         <w:t xml:space="preserve"> is a TypeScript framework for working with datasets. </w:t>
@@ -1375,7 +1414,7 @@
           <w:i/>
           <w:iCs/>
         </w:rPr>
-        <w:t>Tidy-TS</w:t>
+        <w:t>Baseline</w:t>
       </w:r>
       <w:r>
         <w:t xml:space="preserve">. </w:t>
@@ -1437,7 +1476,14 @@
           <w:i/>
           <w:iCs/>
         </w:rPr>
-        <w:t xml:space="preserve">Tidy-TS </w:t>
+        <w:t>Baseline</w:t>
+      </w:r>
+      <w:r>
+        <w:rPr>
+          <w:i/>
+          <w:iCs/>
+        </w:rPr>
+        <w:t xml:space="preserve"> </w:t>
       </w:r>
       <w:r>
         <w:t>track</w:t>
@@ -1489,7 +1535,7 @@
           <w:i/>
           <w:iCs/>
         </w:rPr>
-        <w:t>Tidy-TS</w:t>
+        <w:t>Baseline</w:t>
       </w:r>
       <w:r>
         <w:t xml:space="preserve"> keeps track of th</w:t>
@@ -1578,7 +1624,7 @@
           <w:i/>
           <w:iCs/>
         </w:rPr>
-        <w:t>Tidy-TS</w:t>
+        <w:t>Baseline</w:t>
       </w:r>
       <w:r>
         <w:t xml:space="preserve"> ensures that any imported data matches the expected data types prior to proceeding with built-in data validation checks. </w:t>
@@ -1610,7 +1656,14 @@
           <w:i/>
           <w:iCs/>
         </w:rPr>
-        <w:t xml:space="preserve">Tidy-TS </w:t>
+        <w:t>Baseline</w:t>
+      </w:r>
+      <w:r>
+        <w:rPr>
+          <w:i/>
+          <w:iCs/>
+        </w:rPr>
+        <w:t xml:space="preserve"> </w:t>
       </w:r>
       <w:r>
         <w:t xml:space="preserve">supports an array of common dataset operations, such as filtering, summarizing, modifying columns, and replacing missing values. It also </w:t>
@@ -1702,7 +1755,7 @@
           <w:i/>
           <w:iCs/>
         </w:rPr>
-        <w:t>Tidy-TS</w:t>
+        <w:t>Baseline</w:t>
       </w:r>
       <w:r>
         <w:t>.</w:t>
@@ -1744,7 +1797,7 @@
           <w:i/>
           <w:iCs/>
         </w:rPr>
-        <w:t>Tidy-TS</w:t>
+        <w:t>Baseline</w:t>
       </w:r>
       <w:r>
         <w:t>, Python, and R, we created a standalone, reproducible comparison suite of 65 common error scenarios for clinical data analysis. The test cases were derived from error patterns described in published clinical data quality literature[10][11][12][13][14] and from errors encountered during common data analysis tasks at the University of Utah.</w:t>
@@ -1811,7 +1864,14 @@
           <w:i/>
           <w:iCs/>
         </w:rPr>
-        <w:t xml:space="preserve">Tidy-TS, </w:t>
+        <w:t>Baseline</w:t>
+      </w:r>
+      <w:r>
+        <w:rPr>
+          <w:i/>
+          <w:iCs/>
+        </w:rPr>
+        <w:t xml:space="preserve">, </w:t>
       </w:r>
       <w:r>
         <w:rPr>
@@ -1838,7 +1898,7 @@
           <w:i/>
           <w:iCs/>
         </w:rPr>
-        <w:t>Tidy-TS</w:t>
+        <w:t>Baseline</w:t>
       </w:r>
       <w:r>
         <w:t xml:space="preserve"> tests were run with TypeScript 5.9.2 on Deno 2.7.14, a runtime environment for TypeScript. </w:t>
@@ -1934,7 +1994,16 @@
         <w:spacing w:line="276" w:lineRule="auto"/>
       </w:pPr>
       <w:r>
-        <w:t>The error scenarios were specified from published clinical data quality literature and observed errors at the University of Utah, with categories defined by clinical error type rather than by which language's mechanisms would detect them. Because the suite was authored by the same team that developed Tidy-TS, we performed external validation against an independent bug collection</w:t>
+        <w:t xml:space="preserve">The error scenarios were specified from published clinical data quality literature and observed errors at the University of Utah, with categories defined by clinical error type rather than by which language's mechanisms would detect them. Because the suite was authored by the same team that developed </w:t>
+      </w:r>
+      <w:r>
+        <w:rPr>
+          <w:i/>
+        </w:rPr>
+        <w:t>Baseline</w:t>
+      </w:r>
+      <w:r>
+        <w:t>, we performed external validation against an independent bug collection</w:t>
       </w:r>
       <w:r>
         <w:t xml:space="preserve"> </w:t>
@@ -1977,7 +2046,14 @@
           <w:i/>
           <w:iCs/>
         </w:rPr>
-        <w:t xml:space="preserve">Tidy-TS </w:t>
+        <w:t>Baseline</w:t>
+      </w:r>
+      <w:r>
+        <w:rPr>
+          <w:i/>
+          <w:iCs/>
+        </w:rPr>
+        <w:t xml:space="preserve"> </w:t>
       </w:r>
       <w:r>
         <w:t xml:space="preserve">against a published collection of Python and R data analytics bugs.[15] The collection manually classified bugs from online forums and code repositories, labeling each bug by type, root cause, and effect. We selected the 164 bugs </w:t>
@@ -2038,7 +2114,16 @@
         <w:t>alongside</w:t>
       </w:r>
       <w:r>
-        <w:t xml:space="preserve"> the equivalent Tidy-TS implementation. For each bug, we also determine</w:t>
+        <w:t xml:space="preserve"> the equivalent </w:t>
+      </w:r>
+      <w:r>
+        <w:rPr>
+          <w:i/>
+        </w:rPr>
+        <w:t>Baseline</w:t>
+      </w:r>
+      <w:r>
+        <w:t xml:space="preserve"> implementation. For each bug, we also determine</w:t>
       </w:r>
       <w:r>
         <w:t>d</w:t>
@@ -2149,7 +2234,7 @@
           <w:i/>
           <w:iCs/>
         </w:rPr>
-        <w:t>Tidy-TS</w:t>
+        <w:t>Baseline</w:t>
       </w:r>
       <w:r>
         <w:t xml:space="preserve">, </w:t>
@@ -2185,7 +2270,7 @@
           <w:i/>
           <w:iCs/>
         </w:rPr>
-        <w:t>Tidy-TS</w:t>
+        <w:t>Baseline</w:t>
       </w:r>
       <w:r>
         <w:t xml:space="preserve"> caught 62 of 65 errors </w:t>
@@ -2478,7 +2563,7 @@
           <w:i/>
           <w:iCs/>
         </w:rPr>
-        <w:t>Tidy-TS</w:t>
+        <w:t>Baseline</w:t>
       </w:r>
       <w:r>
         <w:t xml:space="preserve"> halted code execution for 36 </w:t>
@@ -2736,7 +2821,7 @@
           <w:i/>
           <w:iCs/>
         </w:rPr>
-        <w:t>Tidy-TS</w:t>
+        <w:t>Baseline</w:t>
       </w:r>
       <w:r>
         <w:t xml:space="preserve"> before </w:t>
@@ -2771,7 +2856,13 @@
         <w:t>respective</w:t>
       </w:r>
       <w:r>
-        <w:t xml:space="preserve"> Python and R libraries. The remaining 17 no longer reproduce the original </w:t>
+        <w:t xml:space="preserve"> Python and R libraries. The remaining 1</w:t>
+      </w:r>
+      <w:r>
+        <w:t>6</w:t>
+      </w:r>
+      <w:r>
+        <w:t xml:space="preserve"> no longer reproduce the original </w:t>
       </w:r>
       <w:r>
         <w:t>silent failure</w:t>
@@ -2915,7 +3006,7 @@
           <w:i/>
           <w:iCs/>
         </w:rPr>
-        <w:t>Tidy-TS</w:t>
+        <w:t>Baseline</w:t>
       </w:r>
       <w:r>
         <w:t xml:space="preserve"> can serve as an important guardrail to permit AI agents to author increasingly complex, error-free clinical data analys</w:t>
@@ -2934,7 +3025,14 @@
           <w:i/>
           <w:iCs/>
         </w:rPr>
-        <w:t xml:space="preserve">Tidy-TS </w:t>
+        <w:t>Baseline</w:t>
+      </w:r>
+      <w:r>
+        <w:rPr>
+          <w:i/>
+          <w:iCs/>
+        </w:rPr>
+        <w:t xml:space="preserve"> </w:t>
       </w:r>
       <w:r>
         <w:t>in this regard.</w:t>
@@ -2949,7 +3047,14 @@
           <w:i/>
           <w:iCs/>
         </w:rPr>
-        <w:t xml:space="preserve">Tidy-TS </w:t>
+        <w:t>Baseline</w:t>
+      </w:r>
+      <w:r>
+        <w:rPr>
+          <w:i/>
+          <w:iCs/>
+        </w:rPr>
+        <w:t xml:space="preserve"> </w:t>
       </w:r>
       <w:r>
         <w:t xml:space="preserve">occupies a different domain of error prevention than existing tools that primarily evaluate the completeness, conformance, or plausibility of existing clinical data repositories, such as the OHDSI Data Quality Dashboard.[20] Data handling during analysis has been identified as a distinct source of error that these approaches do not address.[21][22] </w:t>
@@ -2959,7 +3064,7 @@
           <w:i/>
           <w:iCs/>
         </w:rPr>
-        <w:t>Tidy-TS</w:t>
+        <w:t>Baseline</w:t>
       </w:r>
       <w:r>
         <w:t xml:space="preserve"> and compile-time data analytics help directly </w:t>
@@ -3006,15 +3111,15 @@
           <w:i/>
           <w:iCs/>
         </w:rPr>
-        <w:t>Tidy-</w:t>
-      </w:r>
-      <w:r>
-        <w:rPr>
-          <w:i/>
-          <w:iCs/>
-        </w:rPr>
         <w:lastRenderedPageBreak/>
-        <w:t xml:space="preserve">TS </w:t>
+        <w:t>Baseline</w:t>
+      </w:r>
+      <w:r>
+        <w:rPr>
+          <w:i/>
+          <w:iCs/>
+        </w:rPr>
+        <w:t xml:space="preserve"> </w:t>
       </w:r>
       <w:r>
         <w:t xml:space="preserve">detects. </w:t>
@@ -3026,7 +3131,16 @@
         <w:t xml:space="preserve"> error </w:t>
       </w:r>
       <w:r>
-        <w:t xml:space="preserve">and add checks manually. Tidy-TS applies equivalent checks automatically through the compiler, whether or not the analyst anticipated the problem in advance. </w:t>
+        <w:t xml:space="preserve">and add checks manually. </w:t>
+      </w:r>
+      <w:r>
+        <w:rPr>
+          <w:i/>
+        </w:rPr>
+        <w:t>Baseline</w:t>
+      </w:r>
+      <w:r>
+        <w:t xml:space="preserve"> applies equivalent checks automatically through the compiler, whether or not the analyst anticipated the problem in advance. </w:t>
       </w:r>
       <w:r>
         <w:t>As such, w</w:t>
@@ -3088,7 +3202,14 @@
           <w:i/>
           <w:iCs/>
         </w:rPr>
-        <w:t xml:space="preserve">Tidy-TS </w:t>
+        <w:t>Baseline</w:t>
+      </w:r>
+      <w:r>
+        <w:rPr>
+          <w:i/>
+          <w:iCs/>
+        </w:rPr>
+        <w:t xml:space="preserve"> </w:t>
       </w:r>
       <w:r>
         <w:t xml:space="preserve">cannot alone account for this error. Likewise, </w:t>
@@ -3098,7 +3219,7 @@
           <w:i/>
           <w:iCs/>
         </w:rPr>
-        <w:t>Tidy-TS</w:t>
+        <w:t>Baseline</w:t>
       </w:r>
       <w:r>
         <w:t xml:space="preserve"> cannot necessarily prevent an analyst from selecting an incorrect hypothesis test or incorrectly specifying a logistic regression. This limitation reflects a distinction between verifying analytical correctness and scientific validity. The latter still requires domain expertise regardless of the programming environment. </w:t>
@@ -3114,7 +3235,7 @@
           <w:i/>
           <w:iCs/>
         </w:rPr>
-        <w:t>Tidy-TS</w:t>
+        <w:t>Baseline</w:t>
       </w:r>
       <w:r>
         <w:t xml:space="preserve"> </w:t>
@@ -3186,7 +3307,16 @@
         <w:t xml:space="preserve">languages that provide pre-execution type checks alone cannot verify that external data actually aligns with the expected shape. </w:t>
       </w:r>
       <w:r>
-        <w:t>This necessitates runtime validation, which Tidy-TS enforces as a strict requirement during data loading to safely support all downstream type checks.</w:t>
+        <w:t xml:space="preserve">This necessitates runtime validation, which </w:t>
+      </w:r>
+      <w:r>
+        <w:rPr>
+          <w:i/>
+        </w:rPr>
+        <w:t>Baseline</w:t>
+      </w:r>
+      <w:r>
+        <w:t xml:space="preserve"> enforces as a strict requirement during data loading to safely support all downstream type checks.</w:t>
       </w:r>
     </w:p>
     <w:p>
@@ -3223,7 +3353,14 @@
           <w:i/>
           <w:iCs/>
         </w:rPr>
-        <w:t xml:space="preserve">Tidy-TS </w:t>
+        <w:t>Baseline</w:t>
+      </w:r>
+      <w:r>
+        <w:rPr>
+          <w:i/>
+          <w:iCs/>
+        </w:rPr>
+        <w:t xml:space="preserve"> </w:t>
       </w:r>
       <w:r>
         <w:t>has been optimized to minimize compiler burden and actively supports ongoing projects at the University of Utah using complex type systems.</w:t>
@@ -3250,7 +3387,7 @@
           <w:i/>
           <w:iCs/>
         </w:rPr>
-        <w:t>Tidy-TS</w:t>
+        <w:t>Baseline</w:t>
       </w:r>
       <w:r>
         <w:t xml:space="preserve"> </w:t>
@@ -3330,6 +3467,7 @@
         <w:spacing w:line="276" w:lineRule="auto"/>
       </w:pPr>
       <w:r>
+        <w:lastRenderedPageBreak/>
         <w:t>Multiple</w:t>
       </w:r>
       <w:r>
@@ -3360,11 +3498,7 @@
         <w:t>manuscript-related analyses</w:t>
       </w:r>
       <w:r>
-        <w:t xml:space="preserve">. All </w:t>
-      </w:r>
-      <w:r>
-        <w:lastRenderedPageBreak/>
-        <w:t>scientific content, study design, analysis, interpretations</w:t>
+        <w:t>. All scientific content, study design, analysis, interpretations</w:t>
       </w:r>
       <w:r>
         <w:t xml:space="preserve">, and manuscript decisions </w:t>
@@ -3383,7 +3517,7 @@
           <w:i/>
           <w:iCs/>
         </w:rPr>
-        <w:t>Tidy-TS</w:t>
+        <w:t>Baseline</w:t>
       </w:r>
       <w:r>
         <w:t xml:space="preserve"> builds on ideas and infrastructure from several open-source projects, including R, Python, </w:t>
@@ -3480,7 +3614,25 @@
         <w:spacing w:line="276" w:lineRule="auto"/>
       </w:pPr>
       <w:r>
-        <w:t xml:space="preserve">The Tidy-TS library, its extensive testing suite, the external validation bug collection, and the full comparison suite of 65 error scenarios (with equivalent implementations in Tidy-TS, pandas, tidyverse, and Polars) are publicly available at </w:t>
+        <w:t xml:space="preserve">The </w:t>
+      </w:r>
+      <w:r>
+        <w:rPr>
+          <w:i/>
+        </w:rPr>
+        <w:t>Baseline</w:t>
+      </w:r>
+      <w:r>
+        <w:t xml:space="preserve"> library, its extensive testing suite, the external validation bug collection, and the full comparison suite of 65 error scenarios (with equivalent implementations in </w:t>
+      </w:r>
+      <w:r>
+        <w:rPr>
+          <w:i/>
+        </w:rPr>
+        <w:t>Baseline</w:t>
+      </w:r>
+      <w:r>
+        <w:t xml:space="preserve">, pandas, tidyverse, and Polars) are publicly available at </w:t>
       </w:r>
       <w:r>
         <w:t>https://github.com/jtmenchaca/tidy-ts (release 2.0.0). All outcomes reported in this paper can be reproduced from the published source code.</w:t>
@@ -3942,7 +4094,7 @@
           <w:i/>
           <w:iCs/>
         </w:rPr>
-        <w:t>Tidy-TS</w:t>
+        <w:t>Baseline</w:t>
       </w:r>
     </w:p>
     <w:p>
@@ -3964,7 +4116,7 @@
           <w:i/>
           <w:iCs/>
         </w:rPr>
-        <w:t>Tidy-TS</w:t>
+        <w:t>Baseline</w:t>
       </w:r>
       <w:r>
         <w:rPr>
@@ -3984,7 +4136,7 @@
           <w:noProof/>
         </w:rPr>
         <w:drawing>
-          <wp:inline distT="0" distB="0" distL="0" distR="0" wp14:anchorId="54057054" wp14:editId="542F5FE3">
+          <wp:inline distT="0" distB="0" distL="0" distR="0" wp14:anchorId="54057054" wp14:editId="2EFBFAEA">
             <wp:extent cx="5943600" cy="4338955"/>
             <wp:effectExtent l="0" t="0" r="0" b="4445"/>
             <wp:docPr id="896061144" name="Picture 5" descr="A diagram of data flow&#10;&#10;AI-generated content may be incorrect."/>
@@ -4106,7 +4258,7 @@
           <w:i/>
           <w:iCs/>
         </w:rPr>
-        <w:t>Tidy-TS</w:t>
+        <w:t>Baseline</w:t>
       </w:r>
       <w:r>
         <w:rPr>
@@ -4145,14 +4297,29 @@
           <w:b w:val="0"/>
           <w:bCs w:val="0"/>
         </w:rPr>
-        <w:t>). Tidy-TS successfully intercepted 100% of errors across all categories, whereas conventional frameworks demonstrated a severe detection gap regarding null and missing data.</w:t>
+        <w:t xml:space="preserve">). </w:t>
+      </w:r>
+      <w:r>
+        <w:rPr>
+          <w:b w:val="0"/>
+          <w:bCs w:val="0"/>
+          <w:i/>
+        </w:rPr>
+        <w:t>Baseline</w:t>
+      </w:r>
+      <w:r>
+        <w:rPr>
+          <w:b w:val="0"/>
+          <w:bCs w:val="0"/>
+        </w:rPr>
+        <w:t xml:space="preserve"> successfully intercepted 100% of errors across all categories, whereas conventional frameworks demonstrated a severe detection gap regarding null and missing data.</w:t>
       </w:r>
       <w:r>
         <w:rPr>
           <w:noProof/>
         </w:rPr>
         <w:drawing>
-          <wp:inline distT="0" distB="0" distL="0" distR="0" wp14:anchorId="2BC37B7B" wp14:editId="1842C294">
+          <wp:inline distT="0" distB="0" distL="0" distR="0" wp14:anchorId="2BC37B7B" wp14:editId="3FD379FF">
             <wp:extent cx="5638800" cy="3084195"/>
             <wp:effectExtent l="0" t="0" r="0" b="1905"/>
             <wp:docPr id="371195175" name="Picture 4" descr="A screenshot of a graph&#10;&#10;AI-generated content may be incorrect."/>
@@ -4276,7 +4443,7 @@
           <w:i/>
           <w:iCs/>
         </w:rPr>
-        <w:t>Tidy-TS</w:t>
+        <w:t>Baseline</w:t>
       </w:r>
       <w:r>
         <w:rPr>
@@ -4464,7 +4631,7 @@
           <w:i/>
           <w:iCs/>
         </w:rPr>
-        <w:t>Tidy-TS</w:t>
+        <w:t>Baseline</w:t>
       </w:r>
       <w:r>
         <w:t>, the 'compile' column indicates errors successfully intercepted before execution, while the 'If bypassed' column indicates errors that would still trigger a runtime halt if static typing checks were explicitly overridden by the analyst.</w:t>
@@ -4534,10 +4701,20 @@
               <w:rPr>
                 <w:b/>
                 <w:bCs/>
-                <w:sz w:val="15"/>
-                <w:szCs w:val="15"/>
-              </w:rPr>
-              <w:t>Tidy-TS (TypeScript)</w:t>
+                <w:i/>
+                <w:sz w:val="15"/>
+                <w:szCs w:val="15"/>
+              </w:rPr>
+              <w:t>Baseline</w:t>
+            </w:r>
+            <w:r>
+              <w:rPr>
+                <w:b/>
+                <w:bCs/>
+                <w:sz w:val="15"/>
+                <w:szCs w:val="15"/>
+              </w:rPr>
+              <w:t xml:space="preserve"> (TypeScript)</w:t>
             </w:r>
           </w:p>
         </w:tc>
@@ -6809,7 +6986,16 @@
       </w:pPr>
       <w:r>
         <w:lastRenderedPageBreak/>
-        <w:t>Supplemental Table 1: Type Rules in Tidy-TS data frames</w:t>
+        <w:t xml:space="preserve">Supplemental Table 1: Type Rules in </w:t>
+      </w:r>
+      <w:r>
+        <w:rPr>
+          <w:i/>
+        </w:rPr>
+        <w:t>Baseline</w:t>
+      </w:r>
+      <w:r>
+        <w:t xml:space="preserve"> data frames</w:t>
       </w:r>
     </w:p>
     <w:p>
@@ -7471,10 +7657,11 @@
               <w:rPr>
                 <w:b/>
                 <w:bCs/>
-                <w:sz w:val="18"/>
-                <w:szCs w:val="18"/>
-              </w:rPr>
-              <w:t>Tidy-TS</w:t>
+                <w:i/>
+                <w:sz w:val="18"/>
+                <w:szCs w:val="18"/>
+              </w:rPr>
+              <w:t>Baseline</w:t>
             </w:r>
           </w:p>
         </w:tc>
@@ -9291,7 +9478,22 @@
           <w:b w:val="0"/>
           <w:bCs w:val="0"/>
         </w:rPr>
-        <w:t>The table below captures the reasoning for excluding bugs from the external collection when evaluating Tidy-TS, Python (</w:t>
+        <w:t xml:space="preserve">The table below captures the reasoning for excluding bugs from the external collection when evaluating </w:t>
+      </w:r>
+      <w:r>
+        <w:rPr>
+          <w:b w:val="0"/>
+          <w:bCs w:val="0"/>
+          <w:i/>
+        </w:rPr>
+        <w:t>Baseline</w:t>
+      </w:r>
+      <w:r>
+        <w:rPr>
+          <w:b w:val="0"/>
+          <w:bCs w:val="0"/>
+        </w:rPr>
+        <w:t>, Python (</w:t>
       </w:r>
       <w:r>
         <w:rPr>

</xml_diff>